<commit_message>
Final update: added author name and polished documentation for MSc Finance application
</commit_message>
<xml_diff>
--- a/docs/results_analysis.docx
+++ b/docs/results_analysis.docx
@@ -35,7 +35,10 @@
         <w:jc w:val="center"/>
       </w:pPr>
       <w:r>
-        <w:t>Candidate / Quantitative Researcher</w:t>
+        <w:rPr>
+          <w:b/>
+        </w:rPr>
+        <w:t>Amit Kumar Dudi</w:t>
       </w:r>
     </w:p>
     <w:p>
@@ -1197,7 +1200,7 @@
         <w:t xml:space="preserve">Mechanism of the Hybrid Model and Risk Architecture: </w:t>
       </w:r>
       <w:r>
-        <w:t>The Hybrid model functions by exploiting the strengths of distinct methodologies: parametric models effectively capture historical volatility persistence and mean-reversion, while Machine Learning algorithms map non-linear shocks and sudden structural breaks. Combining both approaches yields a robust forecast that adapts across diverse market regimes. Furthermore, despite structural inefficiencies, the Student-t VaR model proved effective universally. Because Chinese equities consistently exhibit 'fat tails', Gaussian approximations are systematically insufficient. By leveraging a Student-t distribution parameterized by the hybrid forecast, all indices cleared the strict Kupiec validation (p &gt; 0.05), ensuring that institutional capital buffers accurately reflect downside risk.</w:t>
+        <w:t>The Hybrid model functions by exploiting the strengths of distinct methodologies: parametric models effectively capture historical volatility persistence and mean-reversion, while Machine Learning algorithms map non-linear shocks and sudden structural breaks. Combining both approaches yields a robust forecast that adapts across diverse market regimes. Furthermore, despite structural inefficiencies, the Student-t VaR model proved effective universally. Because Chinese equities consistently exhibit fat tails, Gaussian approximations are systematically insufficient. By leveraging a Student-t distribution parameterized by the hybrid forecast, all indices cleared the strict Kupiec validation (p &gt; 0.05), ensuring that institutional capital buffers accurately reflect downside risk.</w:t>
       </w:r>
     </w:p>
     <w:p>
@@ -1338,7 +1341,7 @@
     </w:p>
     <w:p>
       <w:r>
-        <w:t>3. Interpretability Constraints: The utilization of Random Forest algorithms introduces standard 'black-box' interpretability limitations, making it challenging to isolate the exact economic drivers behind specific volatility predictions.</w:t>
+        <w:t>3. Interpretability Constraints: The utilization of Random Forest algorithms introduces standard black-box interpretability limitations, making it challenging to isolate the exact economic drivers behind specific volatility predictions.</w:t>
       </w:r>
     </w:p>
     <w:p>

</xml_diff>